<commit_message>
website proposal: correct dates — today is July 7, valid through July 15
Kari's actual date is July 7, 2026 (not May 19 as I'd guessed).
Proposal expires July 15, 2026 — same day as project kickoff.
Frank has ~a week to sign.

Updated in HTML (cover meta, payment terms, Next Steps step 03,
footer date + valid-through) and in the website PDF (cover Date + Valid
through, signed-by clause).

Co-Authored-By: Claude Opus 4.7 (1M context) <noreply@anthropic.com>
</commit_message>
<xml_diff>
--- a/proposal-archive/Website_Ecommerce_Proposal_Minuteman.docx
+++ b/proposal-archive/Website_Ecommerce_Proposal_Minuteman.docx
@@ -189,7 +189,7 @@
           <w:sz w:val="22"/>
           <w:szCs w:val="22"/>
         </w:rPr>
-        <w:t xml:space="preserve">Date: May 19, 2026</w:t>
+        <w:t xml:space="preserve">Date: July 7, 2026</w:t>
       </w:r>
     </w:p>
     <w:p>
@@ -208,7 +208,7 @@
           <w:sz w:val="22"/>
           <w:szCs w:val="22"/>
         </w:rPr>
-        <w:t xml:space="preserve">Valid through: June 15, 2026</w:t>
+        <w:t xml:space="preserve">Valid through: July 15, 2026</w:t>
       </w:r>
     </w:p>
     <w:p>
@@ -2608,7 +2608,7 @@
           <w:sz w:val="22"/>
           <w:szCs w:val="22"/>
         </w:rPr>
-        <w:t xml:space="preserve">Signed proposal returned to CARES Consulting by June 15, 2026.</w:t>
+        <w:t xml:space="preserve">Signed proposal returned to CARES Consulting by July 15, 2026.</w:t>
       </w:r>
     </w:p>
     <w:p>

</xml_diff>